<commit_message>
Add Do You See Me companion video
</commit_message>
<xml_diff>
--- a/docs/tech-admin/Hope-Sojourns-Style-Guide.docx
+++ b/docs/tech-admin/Hope-Sojourns-Style-Guide.docx
@@ -130,7 +130,7 @@
           <w:color w:val="60726B"/>
           <w:sz w:val="20"/>
         </w:rPr>
-        <w:t>Version 1.3</w:t>
+        <w:t>Version 1.4</w:t>
       </w:r>
       <w:r>
         <w:rPr>
@@ -146,7 +146,7 @@
           <w:color w:val="60726B"/>
           <w:sz w:val="20"/>
         </w:rPr>
-        <w:t>Last reviewed August 24, 2026</w:t>
+        <w:t>Last reviewed August 29, 2026</w:t>
       </w:r>
     </w:p>
     <w:p>
@@ -8268,6 +8268,151 @@
     </w:p>
     <w:p>
       <w:pPr>
+        <w:pStyle w:val="Heading2"/>
+      </w:pPr>
+      <w:r>
+        <w:rPr>
+          <w:rFonts w:ascii="Georgia" w:hAnsi="Georgia"/>
+          <w:b/>
+          <w:color w:val="275D4D"/>
+          <w:sz w:val="26"/>
+        </w:rPr>
+        <w:t>Embedded video and companion audio</w:t>
+      </w:r>
+    </w:p>
+    <w:p>
+      <w:pPr>
+        <w:keepNext/>
+        <w:keepLines/>
+        <w:numPr>
+          <w:ilvl w:val="0"/>
+          <w:numId w:val="10"/>
+        </w:numPr>
+        <w:spacing w:before="0" w:after="80" w:line="300" w:lineRule="auto"/>
+        <w:ind w:left="540" w:hanging="271"/>
+      </w:pPr>
+      <w:r>
+        <w:rPr>
+          <w:rFonts w:ascii="Segoe UI" w:hAnsi="Segoe UI"/>
+          <w:color w:val="19322B"/>
+          <w:sz w:val="22"/>
+        </w:rPr>
+        <w:t xml:space="preserve">Use YouTube's privacy-enhanced </w:t>
+      </w:r>
+      <w:r>
+        <w:rPr>
+          <w:rFonts w:ascii="Consolas" w:hAnsi="Consolas"/>
+          <w:color w:val="173F35"/>
+          <w:sz w:val="20"/>
+          <w:shd w:fill="EDF5F1"/>
+        </w:rPr>
+        <w:t>youtube-nocookie.com</w:t>
+      </w:r>
+      <w:r>
+        <w:rPr>
+          <w:rFonts w:ascii="Segoe UI" w:hAnsi="Segoe UI"/>
+          <w:color w:val="19322B"/>
+          <w:sz w:val="22"/>
+        </w:rPr>
+        <w:t xml:space="preserve"> host for embedded players.</w:t>
+      </w:r>
+    </w:p>
+    <w:p>
+      <w:pPr>
+        <w:keepLines/>
+        <w:numPr>
+          <w:ilvl w:val="0"/>
+          <w:numId w:val="10"/>
+        </w:numPr>
+        <w:spacing w:before="0" w:after="80" w:line="300" w:lineRule="auto"/>
+        <w:ind w:left="540" w:hanging="271"/>
+      </w:pPr>
+      <w:r>
+        <w:rPr>
+          <w:rFonts w:ascii="Segoe UI" w:hAnsi="Segoe UI"/>
+          <w:color w:val="19322B"/>
+          <w:sz w:val="22"/>
+        </w:rPr>
+        <w:t>Keep embedded video responsive at a 16:9 aspect ratio, provide a descriptive iframe title, allow full-screen playback, and include an external YouTube link as a fallback.</w:t>
+      </w:r>
+    </w:p>
+    <w:p>
+      <w:pPr>
+        <w:keepLines/>
+        <w:numPr>
+          <w:ilvl w:val="0"/>
+          <w:numId w:val="10"/>
+        </w:numPr>
+        <w:spacing w:before="0" w:after="80" w:line="300" w:lineRule="auto"/>
+        <w:ind w:left="540" w:hanging="271"/>
+      </w:pPr>
+      <w:r>
+        <w:rPr>
+          <w:rFonts w:ascii="Segoe UI" w:hAnsi="Segoe UI"/>
+          <w:color w:val="19322B"/>
+          <w:sz w:val="22"/>
+        </w:rPr>
+        <w:t>Introduce each video or audio item with a concise description that explains how it relates to the surrounding resource.</w:t>
+      </w:r>
+    </w:p>
+    <w:p>
+      <w:pPr>
+        <w:keepNext/>
+        <w:keepLines/>
+        <w:numPr>
+          <w:ilvl w:val="0"/>
+          <w:numId w:val="10"/>
+        </w:numPr>
+        <w:spacing w:before="0" w:after="80" w:line="300" w:lineRule="auto"/>
+        <w:ind w:left="540" w:hanging="271"/>
+      </w:pPr>
+      <w:r>
+        <w:rPr>
+          <w:rFonts w:ascii="Segoe UI" w:hAnsi="Segoe UI"/>
+          <w:color w:val="19322B"/>
+          <w:sz w:val="22"/>
+        </w:rPr>
+        <w:t xml:space="preserve">Use native audio controls with </w:t>
+      </w:r>
+      <w:r>
+        <w:rPr>
+          <w:rFonts w:ascii="Consolas" w:hAnsi="Consolas"/>
+          <w:color w:val="173F35"/>
+          <w:sz w:val="20"/>
+          <w:shd w:fill="EDF5F1"/>
+        </w:rPr>
+        <w:t>preload="metadata"</w:t>
+      </w:r>
+      <w:r>
+        <w:rPr>
+          <w:rFonts w:ascii="Segoe UI" w:hAnsi="Segoe UI"/>
+          <w:color w:val="19322B"/>
+          <w:sz w:val="22"/>
+        </w:rPr>
+        <w:t xml:space="preserve"> and include a direct audio link in the fallback text.</w:t>
+      </w:r>
+    </w:p>
+    <w:p>
+      <w:pPr>
+        <w:keepLines/>
+        <w:numPr>
+          <w:ilvl w:val="0"/>
+          <w:numId w:val="10"/>
+        </w:numPr>
+        <w:spacing w:before="0" w:after="80" w:line="300" w:lineRule="auto"/>
+        <w:ind w:left="540" w:hanging="271"/>
+      </w:pPr>
+      <w:r>
+        <w:rPr>
+          <w:rFonts w:ascii="Segoe UI" w:hAnsi="Segoe UI"/>
+          <w:color w:val="19322B"/>
+          <w:sz w:val="22"/>
+        </w:rPr>
+        <w:t>Do not autoplay companion audio on a page that contains another playable media item. Let the visitor decide which experience to begin.</w:t>
+      </w:r>
+    </w:p>
+    <w:p>
+      <w:pPr>
         <w:pStyle w:val="Heading1"/>
       </w:pPr>
       <w:r>
@@ -9694,6 +9839,68 @@
                 <w:sz w:val="18"/>
               </w:rPr>
               <w:t>Change</w:t>
+            </w:r>
+          </w:p>
+        </w:tc>
+      </w:tr>
+      <w:tr>
+        <w:trPr>
+          <w:cantSplit/>
+        </w:trPr>
+        <w:tc>
+          <w:tcPr>
+            <w:tcW w:type="dxa" w:w="2200"/>
+            <w:vAlign w:val="center"/>
+          </w:tcPr>
+          <w:p>
+            <w:pPr>
+              <w:spacing w:before="0" w:after="30" w:line="240" w:lineRule="auto"/>
+            </w:pPr>
+            <w:r>
+              <w:rPr>
+                <w:rFonts w:ascii="Segoe UI" w:hAnsi="Segoe UI"/>
+                <w:color w:val="19322B"/>
+                <w:sz w:val="16"/>
+              </w:rPr>
+              <w:t>2026-08-29</w:t>
+            </w:r>
+          </w:p>
+        </w:tc>
+        <w:tc>
+          <w:tcPr>
+            <w:tcW w:type="dxa" w:w="3580"/>
+            <w:vAlign w:val="center"/>
+          </w:tcPr>
+          <w:p>
+            <w:pPr>
+              <w:spacing w:before="0" w:after="30" w:line="240" w:lineRule="auto"/>
+            </w:pPr>
+            <w:r>
+              <w:rPr>
+                <w:rFonts w:ascii="Segoe UI" w:hAnsi="Segoe UI"/>
+                <w:color w:val="19322B"/>
+                <w:sz w:val="16"/>
+              </w:rPr>
+              <w:t>1.4</w:t>
+            </w:r>
+          </w:p>
+        </w:tc>
+        <w:tc>
+          <w:tcPr>
+            <w:tcW w:type="dxa" w:w="3580"/>
+            <w:vAlign w:val="center"/>
+          </w:tcPr>
+          <w:p>
+            <w:pPr>
+              <w:spacing w:before="0" w:after="30" w:line="240" w:lineRule="auto"/>
+            </w:pPr>
+            <w:r>
+              <w:rPr>
+                <w:rFonts w:ascii="Segoe UI" w:hAnsi="Segoe UI"/>
+                <w:color w:val="19322B"/>
+                <w:sz w:val="16"/>
+              </w:rPr>
+              <w:t>Added the responsive embedded-video and companion-audio standard for resource articles.</w:t>
             </w:r>
           </w:p>
         </w:tc>

</xml_diff>

<commit_message>
Hide traveler sign-in after portal opens
</commit_message>
<xml_diff>
--- a/docs/tech-admin/Hope-Sojourns-Style-Guide.docx
+++ b/docs/tech-admin/Hope-Sojourns-Style-Guide.docx
@@ -9836,7 +9836,7 @@
           <w:color w:val="19322B"/>
           <w:sz w:val="22"/>
         </w:rPr>
-        <w:t>State explicitly that the traveler sign-in does not use a personal email address. Disable repeat submission while opening, announce a slower request, stop stalled requests with a useful retry message, briefly retry the session handoff, and clear the working message after success.</w:t>
+        <w:t>State explicitly that the traveler sign-in does not use a personal email address. Disable repeat submission while opening, announce a slower request, stop stalled requests with a useful retry message, briefly retry the session handoff, and replace the sign-in view with the trip portal after success.</w:t>
       </w:r>
     </w:p>
     <w:p>
@@ -12219,7 +12219,7 @@
                 <w:color w:val="19322B"/>
                 <w:sz w:val="16"/>
               </w:rPr>
-              <w:t>Clarified traveler sign-in identity and required bounded, announced, recoverable session-opening behavior.</w:t>
+              <w:t>Clarified traveler sign-in identity and required bounded, announced, recoverable, single-view session-opening behavior.</w:t>
             </w:r>
           </w:p>
         </w:tc>

</xml_diff>